<commit_message>
Fix Harlan Estate 2021 docx font compatibility issue
https://claude.ai/code/session_01He6qi5Nx39QpWF5Xi2JshP
</commit_message>
<xml_diff>
--- a/naracella-content/blog/harlan-2021.docx
+++ b/naracella-content/blog/harlan-2021.docx
@@ -9,11 +9,15 @@
       <w:r>
         <w:rPr>
           <w:b/>
-          <w:color w:val="555555"/>
+          <w:color w:val="888888"/>
+          <w:sz w:val="20"/>
         </w:rPr>
         <w:t xml:space="preserve">slug: </w:t>
       </w:r>
       <w:r>
+        <w:rPr>
+          <w:sz w:val="20"/>
+        </w:rPr>
         <w:t>harlan-estate-2021-review</w:t>
       </w:r>
     </w:p>
@@ -24,11 +28,15 @@
       <w:r>
         <w:rPr>
           <w:b/>
-          <w:color w:val="555555"/>
+          <w:color w:val="888888"/>
+          <w:sz w:val="20"/>
         </w:rPr>
         <w:t xml:space="preserve">meta-description: </w:t>
       </w:r>
       <w:r>
+        <w:rPr>
+          <w:sz w:val="20"/>
+        </w:rPr>
         <w:t>할란 에스테이트 2021 리뷰. Wine Advocate·James Suckling 100점, Wine Spectator 97점. 블렌드 구성, 테이스팅 노트, 한국 가격과 구매처 정리.</w:t>
       </w:r>
     </w:p>
@@ -39,21 +47,26 @@
       <w:r>
         <w:rPr>
           <w:b/>
-          <w:color w:val="555555"/>
+          <w:color w:val="888888"/>
+          <w:sz w:val="20"/>
         </w:rPr>
         <w:t xml:space="preserve">search-intent: </w:t>
       </w:r>
       <w:r>
+        <w:rPr>
+          <w:sz w:val="20"/>
+        </w:rPr>
         <w:t>commercial</w:t>
       </w:r>
     </w:p>
     <w:p/>
     <w:p>
       <w:pPr>
-        <w:pStyle w:val="Heading1"/>
+        <w:spacing w:before="0" w:after="200"/>
       </w:pPr>
       <w:r>
         <w:rPr>
+          <w:b/>
           <w:color w:val="1A1A2E"/>
           <w:sz w:val="36"/>
         </w:rPr>
@@ -63,23 +76,25 @@
     <w:p>
       <w:pPr>
         <w:spacing w:after="240"/>
-        <w:ind w:left="432"/>
+        <w:ind w:left="432" w:right="432"/>
       </w:pPr>
       <w:r>
         <w:rPr>
           <w:i/>
+          <w:sz w:val="22"/>
         </w:rPr>
         <w:t>2021 할란 에스테이트는 Wine Advocate(리사 페로티-브라운), James Suckling, Decanter 세 곳에서 100점을 받았다. Wine Spectator는 97점을 부여했고, Vinous의 안토니오 갈로니는 "sublime refinement and class"라고 평했다. 국내 독점 수입은 나라셀라가 담당한다.</w:t>
       </w:r>
     </w:p>
     <w:p>
       <w:pPr>
-        <w:pStyle w:val="Heading2"/>
+        <w:spacing w:before="280" w:after="80"/>
       </w:pPr>
       <w:r>
         <w:rPr>
+          <w:b/>
           <w:color w:val="34345C"/>
-          <w:sz w:val="28"/>
+          <w:sz w:val="26"/>
         </w:rPr>
         <w:t>2021 빈티지가 특별한 이유</w:t>
       </w:r>
@@ -89,17 +104,21 @@
         <w:spacing w:after="120"/>
       </w:pPr>
       <w:r>
+        <w:rPr>
+          <w:sz w:val="22"/>
+        </w:rPr>
         <w:t>2020년 캘리포니아 산불은 나파 일대 포도원에 연기 오염(smoke taint) 우려를 남겼다. 2021년은 그 영향에서 완전히 벗어난 첫 빈티지다. 봄 서리 이후 여름은 균일하게 건조하고 따뜻했으며, 9월 초 수확이 마무리되면서 완숙도와 산도를 동시에 확보했다. 평가단 사이에서 "10년 내 가장 깔끔한 나파 빈티지 중 하나"로 언급된다.</w:t>
       </w:r>
     </w:p>
     <w:p>
       <w:pPr>
-        <w:pStyle w:val="Heading2"/>
+        <w:spacing w:before="280" w:after="80"/>
       </w:pPr>
       <w:r>
         <w:rPr>
+          <w:b/>
           <w:color w:val="34345C"/>
-          <w:sz w:val="28"/>
+          <w:sz w:val="26"/>
         </w:rPr>
         <w:t>블렌드 구성</w:t>
       </w:r>
@@ -109,17 +128,21 @@
         <w:spacing w:after="120"/>
       </w:pPr>
       <w:r>
+        <w:rPr>
+          <w:sz w:val="22"/>
+        </w:rPr>
         <w:t>카베르네 소비뇽 80% 이상에 카베르네 프랑과 메를로가 소량 블렌딩된다. 할란 에스테이트는 정확한 비율을 공개하지 않으며, 해마다 오클빌 포도원의 상태에 따라 구성을 조정한다.</w:t>
       </w:r>
     </w:p>
     <w:p>
       <w:pPr>
-        <w:pStyle w:val="Heading2"/>
+        <w:spacing w:before="280" w:after="80"/>
       </w:pPr>
       <w:r>
         <w:rPr>
+          <w:b/>
           <w:color w:val="34345C"/>
-          <w:sz w:val="28"/>
+          <w:sz w:val="26"/>
         </w:rPr>
         <w:t>테이스팅 노트</w:t>
       </w:r>
@@ -131,10 +154,14 @@
       <w:r>
         <w:rPr>
           <w:b/>
+          <w:sz w:val="22"/>
         </w:rPr>
         <w:t xml:space="preserve">[외관]  </w:t>
       </w:r>
       <w:r>
+        <w:rPr>
+          <w:sz w:val="22"/>
+        </w:rPr>
         <w:t>짙은 가넷-퍼플, 가장자리에 깊은 보랏빛이 감돈다.</w:t>
       </w:r>
     </w:p>
@@ -145,10 +172,14 @@
       <w:r>
         <w:rPr>
           <w:b/>
+          <w:sz w:val="22"/>
         </w:rPr>
         <w:t xml:space="preserve">[향]  </w:t>
       </w:r>
       <w:r>
+        <w:rPr>
+          <w:sz w:val="22"/>
+        </w:rPr>
         <w:t>블랙커런트 젤리, 다크 체리, 제비꽃, 흑연이 첫 층을 형성한다. 공기 접촉 후 삼나무, 다크 코코아, 에스프레소, 감초, 블랙 트러플이 올라온다.</w:t>
       </w:r>
     </w:p>
@@ -159,10 +190,14 @@
       <w:r>
         <w:rPr>
           <w:b/>
+          <w:sz w:val="22"/>
         </w:rPr>
         <w:t xml:space="preserve">[미각]  </w:t>
       </w:r>
       <w:r>
+        <w:rPr>
+          <w:sz w:val="22"/>
+        </w:rPr>
         <w:t>중간에서 풀 바디 사이. 타닌은 극도로 부드럽고 촘촘하며, 붉은 과실과 검은 과실 레이어가 긴 피니시 내내 이어진다. Wine Advocate는 "jaw-dropping grace and poise"라고 표현했다.</w:t>
       </w:r>
     </w:p>
@@ -173,23 +208,28 @@
       <w:r>
         <w:rPr>
           <w:b/>
+          <w:sz w:val="22"/>
         </w:rPr>
         <w:t xml:space="preserve">[숙성 잠재력]  </w:t>
       </w:r>
       <w:r>
+        <w:rPr>
+          <w:sz w:val="22"/>
+        </w:rPr>
         <w:t>2041년, 2051년, 심지어 2061년까지 열릴 수 있다는 평가가 나온다. 지금 마시려면 2–3시간 디캔팅이 필수다.</w:t>
       </w:r>
     </w:p>
     <w:p>
       <w:pPr>
-        <w:pStyle w:val="Heading2"/>
+        <w:spacing w:before="280" w:after="80"/>
       </w:pPr>
       <w:r>
         <w:rPr>
+          <w:b/>
           <w:color w:val="34345C"/>
-          <w:sz w:val="28"/>
+          <w:sz w:val="26"/>
         </w:rPr>
-        <w:t>비평가 점수 요약</w:t>
+        <w:t>비평가 점수</w:t>
       </w:r>
     </w:p>
     <w:tbl>
@@ -199,13 +239,13 @@
         <w:tblLook w:firstColumn="1" w:firstRow="1" w:lastColumn="0" w:lastRow="0" w:noHBand="0" w:noVBand="1" w:val="04A0"/>
       </w:tblPr>
       <w:tblGrid>
-        <w:gridCol w:w="4320"/>
-        <w:gridCol w:w="4320"/>
+        <w:gridCol w:w="4680"/>
+        <w:gridCol w:w="4680"/>
       </w:tblGrid>
       <w:tr>
         <w:tc>
           <w:tcPr>
-            <w:tcW w:type="dxa" w:w="4320"/>
+            <w:tcW w:type="dxa" w:w="4680"/>
           </w:tcPr>
           <w:p>
             <w:r>
@@ -218,7 +258,7 @@
         </w:tc>
         <w:tc>
           <w:tcPr>
-            <w:tcW w:type="dxa" w:w="4320"/>
+            <w:tcW w:type="dxa" w:w="4680"/>
           </w:tcPr>
           <w:p>
             <w:r>
@@ -233,7 +273,7 @@
       <w:tr>
         <w:tc>
           <w:tcPr>
-            <w:tcW w:type="dxa" w:w="4320"/>
+            <w:tcW w:type="dxa" w:w="4680"/>
           </w:tcPr>
           <w:p>
             <w:r>
@@ -243,7 +283,7 @@
         </w:tc>
         <w:tc>
           <w:tcPr>
-            <w:tcW w:type="dxa" w:w="4320"/>
+            <w:tcW w:type="dxa" w:w="4680"/>
           </w:tcPr>
           <w:p>
             <w:r>
@@ -255,7 +295,7 @@
       <w:tr>
         <w:tc>
           <w:tcPr>
-            <w:tcW w:type="dxa" w:w="4320"/>
+            <w:tcW w:type="dxa" w:w="4680"/>
           </w:tcPr>
           <w:p>
             <w:r>
@@ -265,7 +305,7 @@
         </w:tc>
         <w:tc>
           <w:tcPr>
-            <w:tcW w:type="dxa" w:w="4320"/>
+            <w:tcW w:type="dxa" w:w="4680"/>
           </w:tcPr>
           <w:p>
             <w:r>
@@ -277,7 +317,7 @@
       <w:tr>
         <w:tc>
           <w:tcPr>
-            <w:tcW w:type="dxa" w:w="4320"/>
+            <w:tcW w:type="dxa" w:w="4680"/>
           </w:tcPr>
           <w:p>
             <w:r>
@@ -287,7 +327,7 @@
         </w:tc>
         <w:tc>
           <w:tcPr>
-            <w:tcW w:type="dxa" w:w="4320"/>
+            <w:tcW w:type="dxa" w:w="4680"/>
           </w:tcPr>
           <w:p>
             <w:r>
@@ -299,7 +339,7 @@
       <w:tr>
         <w:tc>
           <w:tcPr>
-            <w:tcW w:type="dxa" w:w="4320"/>
+            <w:tcW w:type="dxa" w:w="4680"/>
           </w:tcPr>
           <w:p>
             <w:r>
@@ -309,7 +349,7 @@
         </w:tc>
         <w:tc>
           <w:tcPr>
-            <w:tcW w:type="dxa" w:w="4320"/>
+            <w:tcW w:type="dxa" w:w="4680"/>
           </w:tcPr>
           <w:p>
             <w:r>
@@ -322,12 +362,13 @@
     <w:p/>
     <w:p>
       <w:pPr>
-        <w:pStyle w:val="Heading2"/>
+        <w:spacing w:before="280" w:after="80"/>
       </w:pPr>
       <w:r>
         <w:rPr>
+          <w:b/>
           <w:color w:val="34345C"/>
-          <w:sz w:val="28"/>
+          <w:sz w:val="26"/>
         </w:rPr>
         <w:t>한국 시장 정보</w:t>
       </w:r>
@@ -337,17 +378,21 @@
         <w:spacing w:after="120"/>
       </w:pPr>
       <w:r>
-        <w:t>국내 독점 수입사는 나라셀라다. 750ml 기준 국내 공급가는 약 680만 원 수준으로 형성되어 있으며, 판매처별 가격은 다를 수 있다. 국제 시장 평균가는 병당 약 $1,992(세전)로, 세계 최고가 컬트 와인 중 하나다. 공식 배정 대기 명단 외에는 나라셀라 공급 재고를 통해 구매하는 것이 국내에서 가장 확실한 경로다.</w:t>
+        <w:rPr>
+          <w:sz w:val="22"/>
+        </w:rPr>
+        <w:t>국내 독점 수입사는 나라셀라다. 750ml 기준 국내 공급가는 약 680만 원 수준이며, 판매처별 차이가 있다. 국제 시장 평균가는 병당 약 $1,992(세전)로, 세계 최고가 컬트 와인 중 하나다. 공식 배정 대기 명단 외에는 나라셀라 공급 재고를 통해 구매하는 것이 국내에서 가장 확실한 경로다.</w:t>
       </w:r>
     </w:p>
     <w:p>
       <w:pPr>
-        <w:pStyle w:val="Heading2"/>
+        <w:spacing w:before="280" w:after="80"/>
       </w:pPr>
       <w:r>
         <w:rPr>
+          <w:b/>
           <w:color w:val="34345C"/>
-          <w:sz w:val="28"/>
+          <w:sz w:val="26"/>
         </w:rPr>
         <w:t>서빙 가이드</w:t>
       </w:r>
@@ -357,6 +402,9 @@
         <w:pStyle w:val="ListBullet"/>
       </w:pPr>
       <w:r>
+        <w:rPr>
+          <w:sz w:val="22"/>
+        </w:rPr>
         <w:t>서빙 온도: 17–18°C</w:t>
       </w:r>
     </w:p>
@@ -365,6 +413,9 @@
         <w:pStyle w:val="ListBullet"/>
       </w:pPr>
       <w:r>
+        <w:rPr>
+          <w:sz w:val="22"/>
+        </w:rPr>
         <w:t>디캔팅: 지금 열 경우 최소 2–3시간</w:t>
       </w:r>
     </w:p>
@@ -373,6 +424,9 @@
         <w:pStyle w:val="ListBullet"/>
       </w:pPr>
       <w:r>
+        <w:rPr>
+          <w:sz w:val="22"/>
+        </w:rPr>
         <w:t>최적 음용 시기: 2029–2045년</w:t>
       </w:r>
     </w:p>
@@ -381,105 +435,144 @@
         <w:pStyle w:val="ListBullet"/>
       </w:pPr>
       <w:r>
+        <w:rPr>
+          <w:sz w:val="22"/>
+        </w:rPr>
         <w:t>페어링: 건식 숙성 소고기, 트러플을 곁들인 요리, 하드 치즈(파르미지아노 36개월 이상)</w:t>
       </w:r>
     </w:p>
     <w:p/>
     <w:p>
       <w:pPr>
-        <w:pStyle w:val="Heading2"/>
+        <w:spacing w:before="280" w:after="80"/>
       </w:pPr>
       <w:r>
         <w:rPr>
+          <w:b/>
           <w:color w:val="34345C"/>
-          <w:sz w:val="28"/>
+          <w:sz w:val="26"/>
         </w:rPr>
         <w:t>FAQ</w:t>
       </w:r>
     </w:p>
     <w:p>
+      <w:pPr>
+        <w:spacing w:after="40"/>
+      </w:pPr>
       <w:r>
         <w:rPr>
           <w:b/>
+          <w:sz w:val="22"/>
         </w:rPr>
         <w:t>Q. 할란 에스테이트 2021은 국내에서 어디서 구매할 수 있나요?</w:t>
       </w:r>
     </w:p>
     <w:p>
       <w:pPr>
-        <w:spacing w:after="160"/>
+        <w:spacing w:after="200"/>
       </w:pPr>
       <w:r>
+        <w:rPr>
+          <w:sz w:val="22"/>
+        </w:rPr>
         <w:t>A. 국내 독점 수입사는 나라셀라입니다. 재고 상황에 따라 나라셀라 공급 와인샵 및 백화점을 통해 구매할 수 있습니다.</w:t>
       </w:r>
     </w:p>
     <w:p>
+      <w:pPr>
+        <w:spacing w:after="40"/>
+      </w:pPr>
       <w:r>
         <w:rPr>
           <w:b/>
+          <w:sz w:val="22"/>
         </w:rPr>
         <w:t>Q. 국내 가격은 얼마인가요?</w:t>
       </w:r>
     </w:p>
     <w:p>
       <w:pPr>
-        <w:spacing w:after="160"/>
+        <w:spacing w:after="200"/>
       </w:pPr>
       <w:r>
+        <w:rPr>
+          <w:sz w:val="22"/>
+        </w:rPr>
         <w:t>A. 750ml 기준 약 680만 원 수준입니다. 국제 시장가(평균 $1,992 세전)와 환율·관세를 반영한 가격으로, 판매처에 따라 차이가 있을 수 있습니다.</w:t>
       </w:r>
     </w:p>
     <w:p>
+      <w:pPr>
+        <w:spacing w:after="40"/>
+      </w:pPr>
       <w:r>
         <w:rPr>
           <w:b/>
+          <w:sz w:val="22"/>
         </w:rPr>
         <w:t>Q. 2021을 지금 마셔도 되나요?</w:t>
       </w:r>
     </w:p>
     <w:p>
       <w:pPr>
-        <w:spacing w:after="160"/>
+        <w:spacing w:after="200"/>
       </w:pPr>
       <w:r>
-        <w:t>A. 마실 수 있지만, 최적 음용 시기는 2029년 이후입니다. 지금 열 경우 2–3시간 이상 디캔팅을 권장합니다.</w:t>
+        <w:rPr>
+          <w:sz w:val="22"/>
+        </w:rPr>
+        <w:t>A. 마실 수 있지만 최적 음용 시기는 2029년 이후입니다. 지금 열 경우 2–3시간 이상 디캔팅을 권장합니다.</w:t>
       </w:r>
     </w:p>
     <w:p>
+      <w:pPr>
+        <w:spacing w:after="40"/>
+      </w:pPr>
       <w:r>
         <w:rPr>
           <w:b/>
+          <w:sz w:val="22"/>
         </w:rPr>
         <w:t>Q. 2020 빈티지와 비교하면 어떤가요?</w:t>
       </w:r>
     </w:p>
     <w:p>
       <w:pPr>
-        <w:spacing w:after="160"/>
+        <w:spacing w:after="200"/>
       </w:pPr>
       <w:r>
+        <w:rPr>
+          <w:sz w:val="22"/>
+        </w:rPr>
         <w:t>A. 2020은 산불 시즌으로 연기 오염 우려가 일부 있었습니다. 2021은 그 영향이 없는 깨끗한 빈티지로, 전반적으로 더 높은 평가를 받고 있습니다.</w:t>
       </w:r>
     </w:p>
     <w:p>
+      <w:pPr>
+        <w:spacing w:after="40"/>
+      </w:pPr>
       <w:r>
         <w:rPr>
           <w:b/>
+          <w:sz w:val="22"/>
         </w:rPr>
         <w:t>Q. 할란 에스테이트, 본드(Bond), 프로몬토리(Promontory)의 차이는 무엇인가요?</w:t>
       </w:r>
     </w:p>
     <w:p>
       <w:pPr>
-        <w:spacing w:after="160"/>
+        <w:spacing w:after="200"/>
       </w:pPr>
       <w:r>
+        <w:rPr>
+          <w:sz w:val="22"/>
+        </w:rPr>
         <w:t>A. 본드는 할란 패밀리의 싱글 빈야드 시리즈이고, 프로몬토리는 윌 할란이 이끄는 별도 프로젝트입니다. 할란 에스테이트는 패밀리 플래그십으로 가장 높은 배정 우선순위를 갖습니다.</w:t>
       </w:r>
     </w:p>
     <w:sectPr>
       <w:pgSz w:w="12240" w:h="15840"/>
-      <w:pgMar w:top="1440" w:right="1800" w:bottom="1440" w:left="1800" w:header="720" w:footer="720" w:gutter="0"/>
+      <w:pgMar w:top="1440" w:right="1440" w:bottom="1440" w:left="1440" w:header="720" w:footer="720" w:gutter="0"/>
       <w:cols w:space="720"/>
       <w:docGrid w:linePitch="360"/>
     </w:sectPr>
@@ -850,10 +943,6 @@
     <w:name w:val="Normal"/>
     <w:qFormat/>
     <w:rsid w:val="00FC693F"/>
-    <w:rPr>
-      <w:rFonts w:ascii="맑은 고딕" w:hAnsi="맑은 고딕"/>
-      <w:sz w:val="22"/>
-    </w:rPr>
   </w:style>
   <w:style w:type="paragraph" w:styleId="Header">
     <w:name w:val="header"/>

</xml_diff>